<commit_message>
Charlie | Assets in parity with g drive
</commit_message>
<xml_diff>
--- a/MegaByte Jam/Assets/Game Assets/Art/VFX/VFX mood board _ visual guide.docx
+++ b/MegaByte Jam/Assets/Game Assets/Art/VFX/VFX mood board _ visual guide.docx
@@ -33,12 +33,12 @@
           <wp:inline distB="114300" distT="114300" distL="114300" distR="114300">
             <wp:extent cx="3111500" cy="3111500"/>
             <wp:effectExtent b="0" l="0" r="0" t="0"/>
-            <wp:docPr descr="Jet Set Radio-like Bomb Rush Cyberfunk comes out next year | Rock Paper  Shotgun" id="2" name="image3.png"/>
+            <wp:docPr descr="Jet Set Radio-like Bomb Rush Cyberfunk comes out next year | Rock Paper  Shotgun" id="2" name="image2.png"/>
             <a:graphic>
               <a:graphicData uri="http://schemas.openxmlformats.org/drawingml/2006/picture">
                 <pic:pic>
                   <pic:nvPicPr>
-                    <pic:cNvPr descr="Jet Set Radio-like Bomb Rush Cyberfunk comes out next year | Rock Paper  Shotgun" id="0" name="image3.png"/>
+                    <pic:cNvPr descr="Jet Set Radio-like Bomb Rush Cyberfunk comes out next year | Rock Paper  Shotgun" id="0" name="image2.png"/>
                     <pic:cNvPicPr preferRelativeResize="0"/>
                   </pic:nvPicPr>
                   <pic:blipFill>
@@ -89,12 +89,12 @@
           <wp:inline distB="114300" distT="114300" distL="114300" distR="114300">
             <wp:extent cx="5731200" cy="4292600"/>
             <wp:effectExtent b="0" l="0" r="0" t="0"/>
-            <wp:docPr id="3" name="image2.jpg"/>
+            <wp:docPr id="3" name="image3.jpg"/>
             <a:graphic>
               <a:graphicData uri="http://schemas.openxmlformats.org/drawingml/2006/picture">
                 <pic:pic>
                   <pic:nvPicPr>
-                    <pic:cNvPr id="0" name="image2.jpg"/>
+                    <pic:cNvPr id="0" name="image3.jpg"/>
                     <pic:cNvPicPr preferRelativeResize="0"/>
                   </pic:nvPicPr>
                   <pic:blipFill>
@@ -262,6 +262,7 @@
     </w:pPr>
     <w:rPr>
       <w:b w:val="0"/>
+      <w:bCs w:val="0"/>
       <w:sz w:val="32"/>
       <w:szCs w:val="32"/>
     </w:rPr>
@@ -278,6 +279,7 @@
     </w:pPr>
     <w:rPr>
       <w:b w:val="0"/>
+      <w:bCs w:val="0"/>
       <w:color w:val="434343"/>
       <w:sz w:val="28"/>
       <w:szCs w:val="28"/>
@@ -327,6 +329,7 @@
     </w:pPr>
     <w:rPr>
       <w:i w:val="1"/>
+      <w:iCs w:val="1"/>
       <w:color w:val="666666"/>
       <w:sz w:val="22"/>
       <w:szCs w:val="22"/>
@@ -360,6 +363,7 @@
     <w:rPr>
       <w:rFonts w:ascii="Arial" w:cs="Arial" w:eastAsia="Arial" w:hAnsi="Arial"/>
       <w:i w:val="0"/>
+      <w:iCs w:val="0"/>
       <w:color w:val="666666"/>
       <w:sz w:val="30"/>
       <w:szCs w:val="30"/>

</xml_diff>